<commit_message>
feat: New docs template with orcids.
</commit_message>
<xml_diff>
--- a/fiduswriter/dhdconf/static/assets/dhdconf.docx
+++ b/fiduswriter/dhdconf/static/assets/dhdconf.docx
@@ -30,6 +30,16 @@
       <w:r>
         <w:rPr/>
         <w:t>{authors}</w:t>
+      </w:r>
+    </w:p>
+    <w:p>
+      <w:pPr>
+        <w:pStyle w:val="orcidIds"/>
+        <w:rPr/>
+      </w:pPr>
+      <w:r>
+        <w:rPr/>
+        <w:t>{orcidIds}</w:t>
       </w:r>
     </w:p>
     <w:p>

</xml_diff>